<commit_message>
Fixato 1 bug segnalati settimane fa
</commit_message>
<xml_diff>
--- a/GDD - HALF BaKa Fighters.docx
+++ b/GDD - HALF BaKa Fighters.docx
@@ -72,8 +72,6 @@
       <w:r>
         <w:t>6000.2.7f2</w:t>
       </w:r>
-      <w:bookmarkStart w:id="0" w:name="_GoBack"/>
-      <w:bookmarkEnd w:id="0"/>
       <w:r>
         <w:t xml:space="preserve"> </w:t>
       </w:r>
@@ -113,8 +111,8 @@
           <w:szCs w:val="34"/>
         </w:rPr>
       </w:pPr>
-      <w:bookmarkStart w:id="1" w:name="_uc77udbpwr77" w:colFirst="0" w:colLast="0"/>
-      <w:bookmarkEnd w:id="1"/>
+      <w:bookmarkStart w:id="0" w:name="_uc77udbpwr77" w:colFirst="0" w:colLast="0"/>
+      <w:bookmarkEnd w:id="0"/>
     </w:p>
     <w:p>
       <w:pPr>
@@ -335,8 +333,8 @@
           <w:szCs w:val="34"/>
         </w:rPr>
       </w:pPr>
-      <w:bookmarkStart w:id="2" w:name="_5f78eujksd4t" w:colFirst="0" w:colLast="0"/>
-      <w:bookmarkEnd w:id="2"/>
+      <w:bookmarkStart w:id="1" w:name="_5f78eujksd4t" w:colFirst="0" w:colLast="0"/>
+      <w:bookmarkEnd w:id="1"/>
     </w:p>
     <w:p>
       <w:pPr>
@@ -375,8 +373,8 @@
           <w:szCs w:val="26"/>
         </w:rPr>
       </w:pPr>
-      <w:bookmarkStart w:id="3" w:name="_fp23tsiz49uv" w:colFirst="0" w:colLast="0"/>
-      <w:bookmarkEnd w:id="3"/>
+      <w:bookmarkStart w:id="2" w:name="_fp23tsiz49uv" w:colFirst="0" w:colLast="0"/>
+      <w:bookmarkEnd w:id="2"/>
       <w:r>
         <w:rPr>
           <w:b/>
@@ -387,8 +385,8 @@
         </w:rPr>
         <w:t>2.1 Core Loop</w:t>
       </w:r>
-      <w:bookmarkStart w:id="4" w:name="_vm20v6fsv7r8" w:colFirst="0" w:colLast="0"/>
-      <w:bookmarkEnd w:id="4"/>
+      <w:bookmarkStart w:id="3" w:name="_vm20v6fsv7r8" w:colFirst="0" w:colLast="0"/>
+      <w:bookmarkEnd w:id="3"/>
     </w:p>
     <w:p>
       <w:pPr>
@@ -643,6 +641,18 @@
     </w:p>
     <w:p>
       <w:pPr>
+        <w:pStyle w:val="Paragrafoelenco"/>
+        <w:numPr>
+          <w:ilvl w:val="0"/>
+          <w:numId w:val="9"/>
+        </w:numPr>
+      </w:pPr>
+      <w:r>
+        <w:t>HitEffect: Quando il PG subisce del danno viene applicato un effetto flash, mentre quando invece il PG recupera vita prendendo il PowerUp apposito, viene applicato un effetto flash di colore verde. I nemici invece quando subiscono del danno viene applicato un effetto flash di colore rosso.</w:t>
+      </w:r>
+    </w:p>
+    <w:p>
+      <w:pPr>
         <w:pStyle w:val="Titolo3"/>
         <w:numPr>
           <w:ilvl w:val="0"/>
@@ -663,6 +673,23 @@
         </w:rPr>
         <w:t>Eventi di varietà: ingresso in Warp Level (minigioco “genere diverso”) → ottenimento bonus (punti, upgrade, moltiplicatori, energia).</w:t>
       </w:r>
+    </w:p>
+    <w:p>
+      <w:pPr>
+        <w:pStyle w:val="Paragrafoelenco"/>
+        <w:numPr>
+          <w:ilvl w:val="0"/>
+          <w:numId w:val="9"/>
+        </w:numPr>
+      </w:pPr>
+      <w:r>
+        <w:t>EnemyShoot</w:t>
+      </w:r>
+      <w:r>
+        <w:t>: Avrà 8 diverse direzione di sparo, tutto dipendentemente dal nemico che si incontra in scena. (N,S,O,E,NE,NO,SE,SO)</w:t>
+      </w:r>
+      <w:bookmarkStart w:id="4" w:name="_GoBack"/>
+      <w:bookmarkEnd w:id="4"/>
     </w:p>
     <w:p>
       <w:pPr>
@@ -764,7 +791,16 @@
         <w:t xml:space="preserve"> </w:t>
       </w:r>
       <w:r>
-        <w:t>Completare i 6 livelli tematici (fobie/paure) e liberare lo zio Coco sconfiggendo i boss.</w:t>
+        <w:t>Completare il livello tematico</w:t>
+      </w:r>
+      <w:r>
+        <w:t xml:space="preserve"> (fobie/paure) e liberare lo zio Coco sconfiggendo i</w:t>
+      </w:r>
+      <w:r>
+        <w:t>l</w:t>
+      </w:r>
+      <w:r>
+        <w:t xml:space="preserve"> boss.</w:t>
       </w:r>
     </w:p>
     <w:p>
@@ -1066,6 +1102,7 @@
           <w:sz w:val="26"/>
           <w:szCs w:val="26"/>
         </w:rPr>
+        <w:lastRenderedPageBreak/>
         <w:t>2.4 Interazione e Fisica</w:t>
       </w:r>
       <w:bookmarkStart w:id="7" w:name="_g8w2qjcybo26" w:colFirst="0" w:colLast="0"/>
@@ -1111,7 +1148,6 @@
           <w:sz w:val="22"/>
           <w:szCs w:val="22"/>
         </w:rPr>
-        <w:lastRenderedPageBreak/>
         <w:t>Rigidbody2D:</w:t>
       </w:r>
       <w:r>
@@ -1627,6 +1663,7 @@
         <w:spacing w:after="240"/>
       </w:pPr>
       <w:r>
+        <w:lastRenderedPageBreak/>
         <w:t>I principali Prefabs necessari saranno il Player con tutti i suoi s</w:t>
       </w:r>
       <w:r>
@@ -1655,7 +1692,6 @@
           <w:sz w:val="34"/>
           <w:szCs w:val="34"/>
         </w:rPr>
-        <w:lastRenderedPageBreak/>
         <w:t>4. Level Design &amp; World</w:t>
       </w:r>
     </w:p>
@@ -2265,7 +2301,7 @@
   <w:abstractNum w:abstractNumId="1" w15:restartNumberingAfterBreak="0">
     <w:nsid w:val="16916228"/>
     <w:multiLevelType w:val="hybridMultilevel"/>
-    <w:tmpl w:val="BF744E74"/>
+    <w:tmpl w:val="2DAA2792"/>
     <w:lvl w:ilvl="0" w:tplc="04100001">
       <w:start w:val="1"/>
       <w:numFmt w:val="bullet"/>
@@ -4428,7 +4464,7 @@
 </file>
 
 <file path=customXml/itemProps1.xml><?xml version="1.0" encoding="utf-8"?>
-<ds:datastoreItem xmlns:ds="http://schemas.openxmlformats.org/officeDocument/2006/customXml" ds:itemID="{19B09229-C097-4028-B159-388362FCAA1A}">
+<ds:datastoreItem xmlns:ds="http://schemas.openxmlformats.org/officeDocument/2006/customXml" ds:itemID="{FABCCCCB-E9FB-4AA2-B8FD-6B8D01C4D34C}">
   <ds:schemaRefs>
     <ds:schemaRef ds:uri="http://schemas.openxmlformats.org/officeDocument/2006/bibliography"/>
   </ds:schemaRefs>

</xml_diff>